<commit_message>
Publicada la aplicacion web con el arreglo del 401 y guardadas las evidencias del dia
</commit_message>
<xml_diff>
--- a/docs/BITACORA_MARTES_2026-09-29.docx
+++ b/docs/BITACORA_MARTES_2026-09-29.docx
@@ -3042,6 +3042,1944 @@
         <w:t>&gt; demostración tienen que explicar ese camino con este mismo cuadro.</w:t>
       </w:r>
     </w:p>
+    <w:p>
+      <w:r>
+        <w:rPr>
+          <w:b w:val="0"/>
+          <w:color w:val="555555"/>
+          <w:sz w:val="18"/>
+        </w:rPr>
+        <w:t>____________________________________________________________</w:t>
+      </w:r>
+    </w:p>
+    <w:p>
+      <w:pPr>
+        <w:pStyle w:val="Heading1"/>
+      </w:pPr>
+      <w:r>
+        <w:t>9. El trabajo de la noche: los tres pendientes del E3 resueltos</w:t>
+      </w:r>
+    </w:p>
+    <w:p>
+      <w:r>
+        <w:rPr>
+          <w:b w:val="0"/>
+          <w:sz w:val="22"/>
+        </w:rPr>
+        <w:t>Después de la tutoría se leyó la plenaria P4 (la última del módulo) y se trabajó sobre lo que</w:t>
+      </w:r>
+    </w:p>
+    <w:p>
+      <w:r>
+        <w:rPr>
+          <w:b w:val="0"/>
+          <w:sz w:val="22"/>
+        </w:rPr>
+        <w:t>pide. Quedaron hechos tres de los pendientes, con su evidencia.</w:t>
+      </w:r>
+    </w:p>
+    <w:p>
+      <w:pPr>
+        <w:pStyle w:val="Heading2"/>
+      </w:pPr>
+      <w:r>
+        <w:t>9.1 La plenaria P4: lo que pide y lo que faltaba</w:t>
+      </w:r>
+    </w:p>
+    <w:p>
+      <w:r>
+        <w:rPr>
+          <w:b w:val="0"/>
+          <w:sz w:val="22"/>
+        </w:rPr>
+        <w:t>El documento P4_Pruebas_Despliegue_Defensa_Modulo4.pdf se guardó en docs/plenarias/, y sus</w:t>
+      </w:r>
+    </w:p>
+    <w:p>
+      <w:r>
+        <w:rPr>
+          <w:b w:val="0"/>
+          <w:sz w:val="22"/>
+        </w:rPr>
+        <w:t>requisitos quedaron extraídos y cotejados con el estado del proyecto en</w:t>
+      </w:r>
+    </w:p>
+    <w:p>
+      <w:r>
+        <w:rPr>
+          <w:b w:val="0"/>
+          <w:sz w:val="22"/>
+        </w:rPr>
+        <w:t>docs/27_LO_QUE_PIDE_LA_PLENARIA_P4.md. Lo que apareció y no teníamos anotado:</w:t>
+      </w:r>
+    </w:p>
+    <w:tbl>
+      <w:tblPr>
+        <w:tblStyle w:val="TableGrid"/>
+        <w:tblW w:type="auto" w:w="0"/>
+        <w:jc w:val="center"/>
+        <w:tblLook w:firstColumn="1" w:firstRow="1" w:lastColumn="0" w:lastRow="0" w:noHBand="0" w:noVBand="1" w:val="04A0"/>
+      </w:tblPr>
+      <w:tblGrid>
+        <w:gridCol w:w="4320"/>
+        <w:gridCol w:w="4320"/>
+      </w:tblGrid>
+      <w:tr>
+        <w:tc>
+          <w:tcPr>
+            <w:tcW w:type="dxa" w:w="4320"/>
+          </w:tcPr>
+          <w:p>
+            <w:r>
+              <w:rPr>
+                <w:b/>
+                <w:sz w:val="20"/>
+              </w:rPr>
+              <w:t>Requisito de la plenaria</w:t>
+            </w:r>
+          </w:p>
+        </w:tc>
+        <w:tc>
+          <w:tcPr>
+            <w:tcW w:type="dxa" w:w="4320"/>
+          </w:tcPr>
+          <w:p>
+            <w:r>
+              <w:rPr>
+                <w:b/>
+                <w:sz w:val="20"/>
+              </w:rPr>
+              <w:t>Estado al leerlo</w:t>
+            </w:r>
+          </w:p>
+        </w:tc>
+      </w:tr>
+      <w:tr>
+        <w:tc>
+          <w:tcPr>
+            <w:tcW w:type="dxa" w:w="4320"/>
+          </w:tcPr>
+          <w:p>
+            <w:r>
+              <w:rPr>
+                <w:b w:val="0"/>
+                <w:sz w:val="20"/>
+              </w:rPr>
+              <w:t>Una cuenta @proyecto.test por rol, con contraseña de 10 o más caracteres</w:t>
+            </w:r>
+          </w:p>
+        </w:tc>
+        <w:tc>
+          <w:tcPr>
+            <w:tcW w:type="dxa" w:w="4320"/>
+          </w:tcPr>
+          <w:p>
+            <w:r>
+              <w:rPr>
+                <w:b w:val="0"/>
+                <w:sz w:val="20"/>
+              </w:rPr>
+              <w:t>✗ Se usaban correos personales con contraseñas de 6</w:t>
+            </w:r>
+          </w:p>
+        </w:tc>
+      </w:tr>
+      <w:tr>
+        <w:tc>
+          <w:tcPr>
+            <w:tcW w:type="dxa" w:w="4320"/>
+          </w:tcPr>
+          <w:p>
+            <w:r>
+              <w:rPr>
+                <w:b w:val="0"/>
+                <w:sz w:val="20"/>
+              </w:rPr>
+              <w:t>Que la aplicación vuelva al inicio de sesión cuando el token vence</w:t>
+            </w:r>
+          </w:p>
+        </w:tc>
+        <w:tc>
+          <w:tcPr>
+            <w:tcW w:type="dxa" w:w="4320"/>
+          </w:tcPr>
+          <w:p>
+            <w:r>
+              <w:rPr>
+                <w:b w:val="0"/>
+                <w:sz w:val="20"/>
+              </w:rPr>
+              <w:t>✗ Estaba declarado en el código y nunca se usaba</w:t>
+            </w:r>
+          </w:p>
+        </w:tc>
+      </w:tr>
+      <w:tr>
+        <w:tc>
+          <w:tcPr>
+            <w:tcW w:type="dxa" w:w="4320"/>
+          </w:tcPr>
+          <w:p>
+            <w:r>
+              <w:rPr>
+                <w:b w:val="0"/>
+                <w:sz w:val="20"/>
+              </w:rPr>
+              <w:t>Nivel de rendimiento: una medición del RNF sobre la URL pública</w:t>
+            </w:r>
+          </w:p>
+        </w:tc>
+        <w:tc>
+          <w:tcPr>
+            <w:tcW w:type="dxa" w:w="4320"/>
+          </w:tcPr>
+          <w:p>
+            <w:r>
+              <w:rPr>
+                <w:b w:val="0"/>
+                <w:sz w:val="20"/>
+              </w:rPr>
+              <w:t>✗ Por hacer</w:t>
+            </w:r>
+          </w:p>
+        </w:tc>
+      </w:tr>
+      <w:tr>
+        <w:tc>
+          <w:tcPr>
+            <w:tcW w:type="dxa" w:w="4320"/>
+          </w:tcPr>
+          <w:p>
+            <w:r>
+              <w:rPr>
+                <w:b w:val="0"/>
+                <w:sz w:val="20"/>
+              </w:rPr>
+              <w:t>Nivel funcional: el flujo Must con capturas fechadas en producción</w:t>
+            </w:r>
+          </w:p>
+        </w:tc>
+        <w:tc>
+          <w:tcPr>
+            <w:tcW w:type="dxa" w:w="4320"/>
+          </w:tcPr>
+          <w:p>
+            <w:r>
+              <w:rPr>
+                <w:b w:val="0"/>
+                <w:sz w:val="20"/>
+              </w:rPr>
+              <w:t>✗ Por hacer</w:t>
+            </w:r>
+          </w:p>
+        </w:tc>
+      </w:tr>
+      <w:tr>
+        <w:tc>
+          <w:tcPr>
+            <w:tcW w:type="dxa" w:w="4320"/>
+          </w:tcPr>
+          <w:p>
+            <w:r>
+              <w:rPr>
+                <w:b w:val="0"/>
+                <w:sz w:val="20"/>
+              </w:rPr>
+              <w:t>Informes de los ejecutores de prueba versionados en el repositorio</w:t>
+            </w:r>
+          </w:p>
+        </w:tc>
+        <w:tc>
+          <w:tcPr>
+            <w:tcW w:type="dxa" w:w="4320"/>
+          </w:tcPr>
+          <w:p>
+            <w:r>
+              <w:rPr>
+                <w:b w:val="0"/>
+                <w:sz w:val="20"/>
+              </w:rPr>
+              <w:t>✗ Por hacer</w:t>
+            </w:r>
+          </w:p>
+        </w:tc>
+      </w:tr>
+    </w:tbl>
+    <w:p/>
+    <w:p>
+      <w:r>
+        <w:rPr>
+          <w:b w:val="0"/>
+          <w:sz w:val="22"/>
+        </w:rPr>
+        <w:t>También quedó anotado el calendario nuevo: la **T4 del Grupo 3 es el viernes 9 de octubre a las</w:t>
+      </w:r>
+    </w:p>
+    <w:p>
+      <w:r>
+        <w:rPr>
+          <w:b w:val="0"/>
+          <w:sz w:val="22"/>
+        </w:rPr>
+        <w:t>17:00**, con el ensayo de la defensa, y la defensa es del 12 al 15 de octubre, siete minutos de</w:t>
+      </w:r>
+    </w:p>
+    <w:p>
+      <w:r>
+        <w:rPr>
+          <w:b w:val="0"/>
+          <w:sz w:val="22"/>
+        </w:rPr>
+        <w:t>demostración y cinco de preguntas.</w:t>
+      </w:r>
+    </w:p>
+    <w:p>
+      <w:pPr>
+        <w:pStyle w:val="Heading2"/>
+      </w:pPr>
+      <w:r>
+        <w:t>9.2 El 401 devuelve al inicio de sesión</w:t>
+      </w:r>
+    </w:p>
+    <w:p>
+      <w:r>
+        <w:rPr>
+          <w:b w:val="0"/>
+          <w:sz w:val="22"/>
+        </w:rPr>
+        <w:t>Era la pregunta 2 de la defensa («¿qué pasa si el token vence?») y estaba sin resolver: la API</w:t>
+      </w:r>
+    </w:p>
+    <w:p>
+      <w:r>
+        <w:rPr>
+          <w:b w:val="0"/>
+          <w:sz w:val="22"/>
+        </w:rPr>
+        <w:t>respondía 401 correctamente, pero la aplicación se quedaba en la pantalla mostrando un error.</w:t>
+      </w:r>
+    </w:p>
+    <w:tbl>
+      <w:tblPr>
+        <w:tblStyle w:val="TableGrid"/>
+        <w:tblW w:type="auto" w:w="0"/>
+        <w:jc w:val="center"/>
+        <w:tblLook w:firstColumn="1" w:firstRow="1" w:lastColumn="0" w:lastRow="0" w:noHBand="0" w:noVBand="1" w:val="04A0"/>
+      </w:tblPr>
+      <w:tblGrid>
+        <w:gridCol w:w="4320"/>
+        <w:gridCol w:w="4320"/>
+      </w:tblGrid>
+      <w:tr>
+        <w:tc>
+          <w:tcPr>
+            <w:tcW w:type="dxa" w:w="4320"/>
+          </w:tcPr>
+          <w:p>
+            <w:r>
+              <w:rPr>
+                <w:b/>
+                <w:sz w:val="20"/>
+              </w:rPr>
+              <w:t>Archivo</w:t>
+            </w:r>
+          </w:p>
+        </w:tc>
+        <w:tc>
+          <w:tcPr>
+            <w:tcW w:type="dxa" w:w="4320"/>
+          </w:tcPr>
+          <w:p>
+            <w:r>
+              <w:rPr>
+                <w:b/>
+                <w:sz w:val="20"/>
+              </w:rPr>
+              <w:t>Cambio</w:t>
+            </w:r>
+          </w:p>
+        </w:tc>
+      </w:tr>
+      <w:tr>
+        <w:tc>
+          <w:tcPr>
+            <w:tcW w:type="dxa" w:w="4320"/>
+          </w:tcPr>
+          <w:p>
+            <w:r>
+              <w:rPr>
+                <w:b w:val="0"/>
+                <w:sz w:val="20"/>
+              </w:rPr>
+              <w:t>lib/services/api_cliente.dart</w:t>
+            </w:r>
+          </w:p>
+        </w:tc>
+        <w:tc>
+          <w:tcPr>
+            <w:tcW w:type="dxa" w:w="4320"/>
+          </w:tcPr>
+          <w:p>
+            <w:r>
+              <w:rPr>
+                <w:b w:val="0"/>
+                <w:sz w:val="20"/>
+              </w:rPr>
+              <w:t>Cuando el servicio responde 401, avisa en lugar de sólo lanzar el error</w:t>
+            </w:r>
+          </w:p>
+        </w:tc>
+      </w:tr>
+      <w:tr>
+        <w:tc>
+          <w:tcPr>
+            <w:tcW w:type="dxa" w:w="4320"/>
+          </w:tcPr>
+          <w:p>
+            <w:r>
+              <w:rPr>
+                <w:b w:val="0"/>
+                <w:sz w:val="20"/>
+              </w:rPr>
+              <w:t>lib/services/auth_service.dart</w:t>
+            </w:r>
+          </w:p>
+        </w:tc>
+        <w:tc>
+          <w:tcPr>
+            <w:tcW w:type="dxa" w:w="4320"/>
+          </w:tcPr>
+          <w:p>
+            <w:r>
+              <w:rPr>
+                <w:b w:val="0"/>
+                <w:sz w:val="20"/>
+              </w:rPr>
+              <w:t>Cierra la sesión y guarda el motivo</w:t>
+            </w:r>
+          </w:p>
+        </w:tc>
+      </w:tr>
+      <w:tr>
+        <w:tc>
+          <w:tcPr>
+            <w:tcW w:type="dxa" w:w="4320"/>
+          </w:tcPr>
+          <w:p>
+            <w:r>
+              <w:rPr>
+                <w:b w:val="0"/>
+                <w:sz w:val="20"/>
+              </w:rPr>
+              <w:t>lib/main.dart</w:t>
+            </w:r>
+          </w:p>
+        </w:tc>
+        <w:tc>
+          <w:tcPr>
+            <w:tcW w:type="dxa" w:w="4320"/>
+          </w:tcPr>
+          <w:p>
+            <w:r>
+              <w:rPr>
+                <w:b w:val="0"/>
+                <w:sz w:val="20"/>
+              </w:rPr>
+              <w:t>Conecta el aviso con el cierre de sesión</w:t>
+            </w:r>
+          </w:p>
+        </w:tc>
+      </w:tr>
+      <w:tr>
+        <w:tc>
+          <w:tcPr>
+            <w:tcW w:type="dxa" w:w="4320"/>
+          </w:tcPr>
+          <w:p>
+            <w:r>
+              <w:rPr>
+                <w:b w:val="0"/>
+                <w:sz w:val="20"/>
+              </w:rPr>
+              <w:t>lib/screens/login_screen.dart</w:t>
+            </w:r>
+          </w:p>
+        </w:tc>
+        <w:tc>
+          <w:tcPr>
+            <w:tcW w:type="dxa" w:w="4320"/>
+          </w:tcPr>
+          <w:p>
+            <w:r>
+              <w:rPr>
+                <w:b w:val="0"/>
+                <w:sz w:val="20"/>
+              </w:rPr>
+              <w:t>Muestra «Tu sesión venció. Volvé a iniciar sesión.»</w:t>
+            </w:r>
+          </w:p>
+        </w:tc>
+      </w:tr>
+    </w:tbl>
+    <w:p/>
+    <w:p>
+      <w:r>
+        <w:rPr>
+          <w:b w:val="0"/>
+          <w:sz w:val="22"/>
+        </w:rPr>
+        <w:t>La decisión que conviene saber explicar: sólo el 401 del servidor cierra la sesión, no la</w:t>
+      </w:r>
+    </w:p>
+    <w:p>
+      <w:r>
+        <w:rPr>
+          <w:b w:val="0"/>
+          <w:sz w:val="22"/>
+        </w:rPr>
+        <w:t>falta de token en el equipo. Al arrancar, el proveedor de identidad tarda unos milisegundos en</w:t>
+      </w:r>
+    </w:p>
+    <w:p>
+      <w:r>
+        <w:rPr>
+          <w:b w:val="0"/>
+          <w:sz w:val="22"/>
+        </w:rPr>
+        <w:t>restaurar la sesión; si una pantalla pidiera datos en ese instante, cerrar la sesión dejaría al</w:t>
+      </w:r>
+    </w:p>
+    <w:p>
+      <w:r>
+        <w:rPr>
+          <w:b w:val="0"/>
+          <w:sz w:val="22"/>
+        </w:rPr>
+        <w:t>usuario afuera sin motivo. Quedó escrito en el propio código, y hay una prueba que lo comprueba.</w:t>
+      </w:r>
+    </w:p>
+    <w:p>
+      <w:pPr>
+        <w:pStyle w:val="Heading2"/>
+      </w:pPr>
+      <w:r>
+        <w:t>9.3 Las dos cuentas de prueba, una por rol</w:t>
+      </w:r>
+    </w:p>
+    <w:tbl>
+      <w:tblPr>
+        <w:tblStyle w:val="TableGrid"/>
+        <w:tblW w:type="auto" w:w="0"/>
+        <w:jc w:val="center"/>
+        <w:tblLook w:firstColumn="1" w:firstRow="1" w:lastColumn="0" w:lastRow="0" w:noHBand="0" w:noVBand="1" w:val="04A0"/>
+      </w:tblPr>
+      <w:tblGrid>
+        <w:gridCol w:w="2880"/>
+        <w:gridCol w:w="2880"/>
+        <w:gridCol w:w="2880"/>
+      </w:tblGrid>
+      <w:tr>
+        <w:tc>
+          <w:tcPr>
+            <w:tcW w:type="dxa" w:w="2880"/>
+          </w:tcPr>
+          <w:p>
+            <w:r>
+              <w:rPr>
+                <w:b/>
+                <w:sz w:val="20"/>
+              </w:rPr>
+              <w:t>Rol</w:t>
+            </w:r>
+          </w:p>
+        </w:tc>
+        <w:tc>
+          <w:tcPr>
+            <w:tcW w:type="dxa" w:w="2880"/>
+          </w:tcPr>
+          <w:p>
+            <w:r>
+              <w:rPr>
+                <w:b/>
+                <w:sz w:val="20"/>
+              </w:rPr>
+              <w:t>Correo</w:t>
+            </w:r>
+          </w:p>
+        </w:tc>
+        <w:tc>
+          <w:tcPr>
+            <w:tcW w:type="dxa" w:w="2880"/>
+          </w:tcPr>
+          <w:p>
+            <w:r>
+              <w:rPr>
+                <w:b/>
+                <w:sz w:val="20"/>
+              </w:rPr>
+              <w:t>Contraseña</w:t>
+            </w:r>
+          </w:p>
+        </w:tc>
+      </w:tr>
+      <w:tr>
+        <w:tc>
+          <w:tcPr>
+            <w:tcW w:type="dxa" w:w="2880"/>
+          </w:tcPr>
+          <w:p>
+            <w:r>
+              <w:rPr>
+                <w:b w:val="0"/>
+                <w:sz w:val="20"/>
+              </w:rPr>
+              <w:t>Administrador</w:t>
+            </w:r>
+          </w:p>
+        </w:tc>
+        <w:tc>
+          <w:tcPr>
+            <w:tcW w:type="dxa" w:w="2880"/>
+          </w:tcPr>
+          <w:p>
+            <w:r>
+              <w:rPr>
+                <w:b w:val="0"/>
+                <w:sz w:val="20"/>
+              </w:rPr>
+              <w:t>administrador@proyecto.test</w:t>
+            </w:r>
+          </w:p>
+        </w:tc>
+        <w:tc>
+          <w:tcPr>
+            <w:tcW w:type="dxa" w:w="2880"/>
+          </w:tcPr>
+          <w:p>
+            <w:r>
+              <w:rPr>
+                <w:b w:val="0"/>
+                <w:sz w:val="20"/>
+              </w:rPr>
+              <w:t>SIGVACH.Adm.2026</w:t>
+            </w:r>
+          </w:p>
+        </w:tc>
+      </w:tr>
+      <w:tr>
+        <w:tc>
+          <w:tcPr>
+            <w:tcW w:type="dxa" w:w="2880"/>
+          </w:tcPr>
+          <w:p>
+            <w:r>
+              <w:rPr>
+                <w:b w:val="0"/>
+                <w:sz w:val="20"/>
+              </w:rPr>
+              <w:t>Operador</w:t>
+            </w:r>
+          </w:p>
+        </w:tc>
+        <w:tc>
+          <w:tcPr>
+            <w:tcW w:type="dxa" w:w="2880"/>
+          </w:tcPr>
+          <w:p>
+            <w:r>
+              <w:rPr>
+                <w:b w:val="0"/>
+                <w:sz w:val="20"/>
+              </w:rPr>
+              <w:t>operador@proyecto.test</w:t>
+            </w:r>
+          </w:p>
+        </w:tc>
+        <w:tc>
+          <w:tcPr>
+            <w:tcW w:type="dxa" w:w="2880"/>
+          </w:tcPr>
+          <w:p>
+            <w:r>
+              <w:rPr>
+                <w:b w:val="0"/>
+                <w:sz w:val="20"/>
+              </w:rPr>
+              <w:t>SIGVACH.Ope.2026</w:t>
+            </w:r>
+          </w:p>
+        </w:tc>
+      </w:tr>
+    </w:tbl>
+    <w:p/>
+    <w:p>
+      <w:r>
+        <w:rPr>
+          <w:b w:val="0"/>
+          <w:sz w:val="22"/>
+        </w:rPr>
+        <w:t>Se crearon en Firebase Authentication, se les creó el perfil con el rol de menor privilegio y el</w:t>
+      </w:r>
+    </w:p>
+    <w:p>
+      <w:r>
+        <w:rPr>
+          <w:b w:val="0"/>
+          <w:sz w:val="22"/>
+        </w:rPr>
+        <w:t>ascenso del administrador se hizo por el servicio, que es la vía correcta. Las credenciales</w:t>
+      </w:r>
+    </w:p>
+    <w:p>
+      <w:r>
+        <w:rPr>
+          <w:b w:val="0"/>
+          <w:sz w:val="22"/>
+        </w:rPr>
+        <w:t>quedaron en el README y en el campo de texto de la entrega, nunca en el documento. Las dos cuentas</w:t>
+      </w:r>
+    </w:p>
+    <w:p>
+      <w:r>
+        <w:rPr>
+          <w:b w:val="0"/>
+          <w:sz w:val="22"/>
+        </w:rPr>
+        <w:t>anteriores, con correos reales y contraseñas cortas, quedaron fuera de circulación.</w:t>
+      </w:r>
+    </w:p>
+    <w:p>
+      <w:r>
+        <w:rPr>
+          <w:b w:val="0"/>
+          <w:sz w:val="22"/>
+        </w:rPr>
+        <w:t>La comprobación contra el servicio publicado, en evidencia/cuentas-de-prueba-2026-09-29.txt:</w:t>
+      </w:r>
+    </w:p>
+    <w:tbl>
+      <w:tblPr>
+        <w:tblStyle w:val="TableGrid"/>
+        <w:tblW w:type="auto" w:w="0"/>
+        <w:jc w:val="center"/>
+        <w:tblLook w:firstColumn="1" w:firstRow="1" w:lastColumn="0" w:lastRow="0" w:noHBand="0" w:noVBand="1" w:val="04A0"/>
+      </w:tblPr>
+      <w:tblGrid>
+        <w:gridCol w:w="2880"/>
+        <w:gridCol w:w="2880"/>
+        <w:gridCol w:w="2880"/>
+      </w:tblGrid>
+      <w:tr>
+        <w:tc>
+          <w:tcPr>
+            <w:tcW w:type="dxa" w:w="2880"/>
+          </w:tcPr>
+          <w:p>
+            <w:r>
+              <w:rPr>
+                <w:b/>
+                <w:sz w:val="20"/>
+              </w:rPr>
+              <w:t>Caso</w:t>
+            </w:r>
+          </w:p>
+        </w:tc>
+        <w:tc>
+          <w:tcPr>
+            <w:tcW w:type="dxa" w:w="2880"/>
+          </w:tcPr>
+          <w:p>
+            <w:r>
+              <w:rPr>
+                <w:b/>
+                <w:sz w:val="20"/>
+              </w:rPr>
+              <w:t>Petición</w:t>
+            </w:r>
+          </w:p>
+        </w:tc>
+        <w:tc>
+          <w:tcPr>
+            <w:tcW w:type="dxa" w:w="2880"/>
+          </w:tcPr>
+          <w:p>
+            <w:r>
+              <w:rPr>
+                <w:b/>
+                <w:sz w:val="20"/>
+              </w:rPr>
+              <w:t>Respuesta</w:t>
+            </w:r>
+          </w:p>
+        </w:tc>
+      </w:tr>
+      <w:tr>
+        <w:tc>
+          <w:tcPr>
+            <w:tcW w:type="dxa" w:w="2880"/>
+          </w:tcPr>
+          <w:p>
+            <w:r>
+              <w:rPr>
+                <w:b w:val="0"/>
+                <w:sz w:val="20"/>
+              </w:rPr>
+              <w:t>1</w:t>
+            </w:r>
+          </w:p>
+        </w:tc>
+        <w:tc>
+          <w:tcPr>
+            <w:tcW w:type="dxa" w:w="2880"/>
+          </w:tcPr>
+          <w:p>
+            <w:r>
+              <w:rPr>
+                <w:b w:val="0"/>
+                <w:sz w:val="20"/>
+              </w:rPr>
+              <w:t>GET /usuarios sin token</w:t>
+            </w:r>
+          </w:p>
+        </w:tc>
+        <w:tc>
+          <w:tcPr>
+            <w:tcW w:type="dxa" w:w="2880"/>
+          </w:tcPr>
+          <w:p>
+            <w:r>
+              <w:rPr>
+                <w:b w:val="0"/>
+                <w:sz w:val="20"/>
+              </w:rPr>
+              <w:t>401</w:t>
+            </w:r>
+          </w:p>
+        </w:tc>
+      </w:tr>
+      <w:tr>
+        <w:tc>
+          <w:tcPr>
+            <w:tcW w:type="dxa" w:w="2880"/>
+          </w:tcPr>
+          <w:p>
+            <w:r>
+              <w:rPr>
+                <w:b w:val="0"/>
+                <w:sz w:val="20"/>
+              </w:rPr>
+              <w:t>2</w:t>
+            </w:r>
+          </w:p>
+        </w:tc>
+        <w:tc>
+          <w:tcPr>
+            <w:tcW w:type="dxa" w:w="2880"/>
+          </w:tcPr>
+          <w:p>
+            <w:r>
+              <w:rPr>
+                <w:b w:val="0"/>
+                <w:sz w:val="20"/>
+              </w:rPr>
+              <w:t>GET /usuarios con el operador</w:t>
+            </w:r>
+          </w:p>
+        </w:tc>
+        <w:tc>
+          <w:tcPr>
+            <w:tcW w:type="dxa" w:w="2880"/>
+          </w:tcPr>
+          <w:p>
+            <w:r>
+              <w:rPr>
+                <w:b w:val="0"/>
+                <w:sz w:val="20"/>
+              </w:rPr>
+              <w:t>403, con rol_requerido y rol_actual</w:t>
+            </w:r>
+          </w:p>
+        </w:tc>
+      </w:tr>
+      <w:tr>
+        <w:tc>
+          <w:tcPr>
+            <w:tcW w:type="dxa" w:w="2880"/>
+          </w:tcPr>
+          <w:p>
+            <w:r>
+              <w:rPr>
+                <w:b w:val="0"/>
+                <w:sz w:val="20"/>
+              </w:rPr>
+              <w:t>3</w:t>
+            </w:r>
+          </w:p>
+        </w:tc>
+        <w:tc>
+          <w:tcPr>
+            <w:tcW w:type="dxa" w:w="2880"/>
+          </w:tcPr>
+          <w:p>
+            <w:r>
+              <w:rPr>
+                <w:b w:val="0"/>
+                <w:sz w:val="20"/>
+              </w:rPr>
+              <w:t>GET /lecturas con el mismo operador</w:t>
+            </w:r>
+          </w:p>
+        </w:tc>
+        <w:tc>
+          <w:tcPr>
+            <w:tcW w:type="dxa" w:w="2880"/>
+          </w:tcPr>
+          <w:p>
+            <w:r>
+              <w:rPr>
+                <w:b w:val="0"/>
+                <w:sz w:val="20"/>
+              </w:rPr>
+              <w:t>200</w:t>
+            </w:r>
+          </w:p>
+        </w:tc>
+      </w:tr>
+      <w:tr>
+        <w:tc>
+          <w:tcPr>
+            <w:tcW w:type="dxa" w:w="2880"/>
+          </w:tcPr>
+          <w:p>
+            <w:r>
+              <w:rPr>
+                <w:b w:val="0"/>
+                <w:sz w:val="20"/>
+              </w:rPr>
+              <w:t>4</w:t>
+            </w:r>
+          </w:p>
+        </w:tc>
+        <w:tc>
+          <w:tcPr>
+            <w:tcW w:type="dxa" w:w="2880"/>
+          </w:tcPr>
+          <w:p>
+            <w:r>
+              <w:rPr>
+                <w:b w:val="0"/>
+                <w:sz w:val="20"/>
+              </w:rPr>
+              <w:t>GET /usuarios con el administrador</w:t>
+            </w:r>
+          </w:p>
+        </w:tc>
+        <w:tc>
+          <w:tcPr>
+            <w:tcW w:type="dxa" w:w="2880"/>
+          </w:tcPr>
+          <w:p>
+            <w:r>
+              <w:rPr>
+                <w:b w:val="0"/>
+                <w:sz w:val="20"/>
+              </w:rPr>
+              <w:t>200</w:t>
+            </w:r>
+          </w:p>
+        </w:tc>
+      </w:tr>
+    </w:tbl>
+    <w:p/>
+    <w:p>
+      <w:r>
+        <w:rPr>
+          <w:b w:val="0"/>
+          <w:sz w:val="22"/>
+        </w:rPr>
+        <w:t>El caso 3 es el que importa para la defensa: demuestra que el 403 no es un bloqueo de la cuenta,</w:t>
+      </w:r>
+    </w:p>
+    <w:p>
+      <w:r>
+        <w:rPr>
+          <w:b w:val="0"/>
+          <w:sz w:val="22"/>
+        </w:rPr>
+        <w:t>sino de la operación.</w:t>
+      </w:r>
+    </w:p>
+    <w:p>
+      <w:pPr>
+        <w:pStyle w:val="Heading2"/>
+      </w:pPr>
+      <w:r>
+        <w:t>9.4 Se cerró una escalada de privilegios</w:t>
+      </w:r>
+    </w:p>
+    <w:p>
+      <w:r>
+        <w:rPr>
+          <w:b w:val="0"/>
+          <w:sz w:val="22"/>
+        </w:rPr>
+        <w:t>Al revisar cómo se asigna el rol apareció esto: el rol de administrador se concedía por correo.</w:t>
+      </w:r>
+    </w:p>
+    <w:p>
+      <w:r>
+        <w:rPr>
+          <w:b w:val="0"/>
+          <w:sz w:val="22"/>
+        </w:rPr>
+        <w:t>El alta de un perfil admitía rol: administrador para admin@sigvach.com, en la aplicación y en</w:t>
+      </w:r>
+    </w:p>
+    <w:p>
+      <w:r>
+        <w:rPr>
+          <w:b w:val="0"/>
+          <w:sz w:val="22"/>
+        </w:rPr>
+        <w:t>las reglas de la base. Cualquiera que consiguiera registrarse con ese correo obtenía las</w:t>
+      </w:r>
+    </w:p>
+    <w:p>
+      <w:r>
+        <w:rPr>
+          <w:b w:val="0"/>
+          <w:sz w:val="22"/>
+        </w:rPr>
+        <w:t>atribuciones sin que nadie se las diera, lo que contradice el principio de menor privilegio que</w:t>
+      </w:r>
+    </w:p>
+    <w:p>
+      <w:r>
+        <w:rPr>
+          <w:b w:val="0"/>
+          <w:sz w:val="22"/>
+        </w:rPr>
+        <w:t>exige la plenaria.</w:t>
+      </w:r>
+    </w:p>
+    <w:p>
+      <w:r>
+        <w:rPr>
+          <w:b w:val="0"/>
+          <w:sz w:val="22"/>
+        </w:rPr>
+        <w:t>Se retiró la excepción en los dos lugares, se actualizaron los documentos que la describían y se</w:t>
+      </w:r>
+    </w:p>
+    <w:p>
+      <w:r>
+        <w:rPr>
+          <w:b w:val="0"/>
+          <w:sz w:val="22"/>
+        </w:rPr>
+        <w:t>publicaron las reglas con firebase deploy --only firestore:rules. Las reglas publicadas se</w:t>
+      </w:r>
+    </w:p>
+    <w:p>
+      <w:r>
+        <w:rPr>
+          <w:b w:val="0"/>
+          <w:sz w:val="22"/>
+        </w:rPr>
+        <w:t>compararon después contra el archivo del repositorio: **el contenido coincide, carácter por</w:t>
+      </w:r>
+    </w:p>
+    <w:p>
+      <w:r>
+        <w:rPr>
+          <w:b w:val="0"/>
+          <w:sz w:val="22"/>
+        </w:rPr>
+        <w:t>carácter**.</w:t>
+      </w:r>
+    </w:p>
+    <w:p>
+      <w:r>
+        <w:rPr>
+          <w:b w:val="0"/>
+          <w:sz w:val="22"/>
+        </w:rPr>
+        <w:t>Y se probó el efecto, no sólo la publicación: con el token de la cuenta de operador se intentó</w:t>
+      </w:r>
+    </w:p>
+    <w:p>
+      <w:r>
+        <w:rPr>
+          <w:b w:val="0"/>
+          <w:sz w:val="22"/>
+        </w:rPr>
+        <w:t>cambiar el rol propio a administrador contra la API de Firestore.</w:t>
+      </w:r>
+    </w:p>
+    <w:p>
+      <w:pPr>
+        <w:ind w:left="360"/>
+        <w:shd w:val="clear" w:fill="F2F2F2"/>
+      </w:pPr>
+      <w:r>
+        <w:rPr>
+          <w:rFonts w:ascii="Consolas" w:hAnsi="Consolas"/>
+          <w:b w:val="0"/>
+          <w:color w:val="1F3B73"/>
+          <w:sz w:val="18"/>
+        </w:rPr>
+        <w:t>Petición  : PATCH usuarios/&lt;uid propio&gt;  con  rol = administrador</w:t>
+        <w:br/>
+        <w:t>Respuesta : HTTP 403</w:t>
+        <w:br/>
+        <w:t xml:space="preserve">            {"error":{"code":403,"message":"Missing or insufficient permissions.",</w:t>
+        <w:br/>
+        <w:t xml:space="preserve">                      "status":"PERMISSION_DENIED"}}</w:t>
+      </w:r>
+    </w:p>
+    <w:p/>
+    <w:p>
+      <w:r>
+        <w:rPr>
+          <w:b w:val="0"/>
+          <w:sz w:val="22"/>
+        </w:rPr>
+        <w:t>Es la respuesta que hay que saber dar en la defensa: **el rol no se concede desde el cliente; ni</w:t>
+      </w:r>
+    </w:p>
+    <w:p>
+      <w:r>
+        <w:rPr>
+          <w:b w:val="0"/>
+          <w:sz w:val="22"/>
+        </w:rPr>
+        <w:t>siquiera la base lo permite**.</w:t>
+      </w:r>
+    </w:p>
+    <w:p>
+      <w:pPr>
+        <w:pStyle w:val="Heading2"/>
+      </w:pPr>
+      <w:r>
+        <w:t>9.5 La aplicación publicada, actualizada</w:t>
+      </w:r>
+    </w:p>
+    <w:p>
+      <w:r>
+        <w:rPr>
+          <w:b w:val="0"/>
+          <w:sz w:val="22"/>
+        </w:rPr>
+        <w:t>Se volvió a compilar con la dirección del servicio publicado (flutter build web con</w:t>
+      </w:r>
+    </w:p>
+    <w:p>
+      <w:r>
+        <w:rPr>
+          <w:b w:val="0"/>
+          <w:sz w:val="22"/>
+        </w:rPr>
+        <w:t>--dart-define=API_BASE_URL=https://sigvach-api.onrender.com) y se desplegó a Firebase Hosting. La</w:t>
+      </w:r>
+    </w:p>
+    <w:p>
+      <w:r>
+        <w:rPr>
+          <w:b w:val="0"/>
+          <w:sz w:val="22"/>
+        </w:rPr>
+        <w:t>verificación posterior comprobó las cuatro cosas: que el paquete publicado pide los datos al</w:t>
+      </w:r>
+    </w:p>
+    <w:p>
+      <w:r>
+        <w:rPr>
+          <w:b w:val="0"/>
+          <w:sz w:val="22"/>
+        </w:rPr>
+        <w:t>servicio publicado, que coincide con la compilación local, que la ruta de salud responde</w:t>
+      </w:r>
+    </w:p>
+    <w:p>
+      <w:r>
+        <w:rPr>
+          <w:b w:val="0"/>
+          <w:sz w:val="22"/>
+        </w:rPr>
+        <w:t>{"estado":"ok","base_de_datos":"conectada"} y que el origen está autorizado (CORS y examen</w:t>
+      </w:r>
+    </w:p>
+    <w:p>
+      <w:r>
+        <w:rPr>
+          <w:b w:val="0"/>
+          <w:sz w:val="22"/>
+        </w:rPr>
+        <w:t>previo correctos).</w:t>
+      </w:r>
+    </w:p>
+    <w:p>
+      <w:pPr>
+        <w:pStyle w:val="Heading2"/>
+      </w:pPr>
+      <w:r>
+        <w:t>9.6 Las pruebas, con su informe versionado</w:t>
+      </w:r>
+    </w:p>
+    <w:tbl>
+      <w:tblPr>
+        <w:tblStyle w:val="TableGrid"/>
+        <w:tblW w:type="auto" w:w="0"/>
+        <w:jc w:val="center"/>
+        <w:tblLook w:firstColumn="1" w:firstRow="1" w:lastColumn="0" w:lastRow="0" w:noHBand="0" w:noVBand="1" w:val="04A0"/>
+      </w:tblPr>
+      <w:tblGrid>
+        <w:gridCol w:w="2880"/>
+        <w:gridCol w:w="2880"/>
+        <w:gridCol w:w="2880"/>
+      </w:tblGrid>
+      <w:tr>
+        <w:tc>
+          <w:tcPr>
+            <w:tcW w:type="dxa" w:w="2880"/>
+          </w:tcPr>
+          <w:p>
+            <w:r>
+              <w:rPr>
+                <w:b/>
+                <w:sz w:val="20"/>
+              </w:rPr>
+              <w:t>Batería</w:t>
+            </w:r>
+          </w:p>
+        </w:tc>
+        <w:tc>
+          <w:tcPr>
+            <w:tcW w:type="dxa" w:w="2880"/>
+          </w:tcPr>
+          <w:p>
+            <w:r>
+              <w:rPr>
+                <w:b/>
+                <w:sz w:val="20"/>
+              </w:rPr>
+              <w:t>Comando</w:t>
+            </w:r>
+          </w:p>
+        </w:tc>
+        <w:tc>
+          <w:tcPr>
+            <w:tcW w:type="dxa" w:w="2880"/>
+          </w:tcPr>
+          <w:p>
+            <w:r>
+              <w:rPr>
+                <w:b/>
+                <w:sz w:val="20"/>
+              </w:rPr>
+              <w:t>Resultado</w:t>
+            </w:r>
+          </w:p>
+        </w:tc>
+      </w:tr>
+      <w:tr>
+        <w:tc>
+          <w:tcPr>
+            <w:tcW w:type="dxa" w:w="2880"/>
+          </w:tcPr>
+          <w:p>
+            <w:r>
+              <w:rPr>
+                <w:b w:val="0"/>
+                <w:sz w:val="20"/>
+              </w:rPr>
+              <w:t>Servicio</w:t>
+            </w:r>
+          </w:p>
+        </w:tc>
+        <w:tc>
+          <w:tcPr>
+            <w:tcW w:type="dxa" w:w="2880"/>
+          </w:tcPr>
+          <w:p>
+            <w:r>
+              <w:rPr>
+                <w:b w:val="0"/>
+                <w:sz w:val="20"/>
+              </w:rPr>
+              <w:t>pytest backend -q --no-header -p no:cacheprovider</w:t>
+            </w:r>
+          </w:p>
+        </w:tc>
+        <w:tc>
+          <w:tcPr>
+            <w:tcW w:type="dxa" w:w="2880"/>
+          </w:tcPr>
+          <w:p>
+            <w:r>
+              <w:rPr>
+                <w:b w:val="0"/>
+                <w:sz w:val="20"/>
+              </w:rPr>
+              <w:t>106 pruebas, 0 fallos (7,24 s)</w:t>
+            </w:r>
+          </w:p>
+        </w:tc>
+      </w:tr>
+      <w:tr>
+        <w:tc>
+          <w:tcPr>
+            <w:tcW w:type="dxa" w:w="2880"/>
+          </w:tcPr>
+          <w:p>
+            <w:r>
+              <w:rPr>
+                <w:b w:val="0"/>
+                <w:sz w:val="20"/>
+              </w:rPr>
+              <w:t>Aplicación</w:t>
+            </w:r>
+          </w:p>
+        </w:tc>
+        <w:tc>
+          <w:tcPr>
+            <w:tcW w:type="dxa" w:w="2880"/>
+          </w:tcPr>
+          <w:p>
+            <w:r>
+              <w:rPr>
+                <w:b w:val="0"/>
+                <w:sz w:val="20"/>
+              </w:rPr>
+              <w:t>flutter test</w:t>
+            </w:r>
+          </w:p>
+        </w:tc>
+        <w:tc>
+          <w:tcPr>
+            <w:tcW w:type="dxa" w:w="2880"/>
+          </w:tcPr>
+          <w:p>
+            <w:r>
+              <w:rPr>
+                <w:b w:val="0"/>
+                <w:sz w:val="20"/>
+              </w:rPr>
+              <w:t>96 pruebas en verde (eran 93: se agregaron 3 del cierre de sesión)</w:t>
+            </w:r>
+          </w:p>
+        </w:tc>
+      </w:tr>
+      <w:tr>
+        <w:tc>
+          <w:tcPr>
+            <w:tcW w:type="dxa" w:w="2880"/>
+          </w:tcPr>
+          <w:p>
+            <w:r>
+              <w:rPr>
+                <w:b w:val="0"/>
+                <w:sz w:val="20"/>
+              </w:rPr>
+              <w:t>Análisis estático</w:t>
+            </w:r>
+          </w:p>
+        </w:tc>
+        <w:tc>
+          <w:tcPr>
+            <w:tcW w:type="dxa" w:w="2880"/>
+          </w:tcPr>
+          <w:p>
+            <w:r>
+              <w:rPr>
+                <w:b w:val="0"/>
+                <w:sz w:val="20"/>
+              </w:rPr>
+              <w:t>flutter analyze</w:t>
+            </w:r>
+          </w:p>
+        </w:tc>
+        <w:tc>
+          <w:tcPr>
+            <w:tcW w:type="dxa" w:w="2880"/>
+          </w:tcPr>
+          <w:p>
+            <w:r>
+              <w:rPr>
+                <w:b w:val="0"/>
+                <w:sz w:val="20"/>
+              </w:rPr>
+              <w:t>Sin observaciones</w:t>
+            </w:r>
+          </w:p>
+        </w:tc>
+      </w:tr>
+    </w:tbl>
+    <w:p/>
+    <w:p>
+      <w:r>
+        <w:rPr>
+          <w:b w:val="0"/>
+          <w:sz w:val="22"/>
+        </w:rPr>
+        <w:t>Total: 202 pruebas automatizadas. Los informes quedaron en evidencia/ con la fecha en el</w:t>
+      </w:r>
+    </w:p>
+    <w:p>
+      <w:r>
+        <w:rPr>
+          <w:b w:val="0"/>
+          <w:sz w:val="22"/>
+        </w:rPr>
+        <w:t>nombre, y el del servicio también en formato JUnit (.xml), para poder leer los números sin abrir</w:t>
+      </w:r>
+    </w:p>
+    <w:p>
+      <w:r>
+        <w:rPr>
+          <w:b w:val="0"/>
+          <w:sz w:val="22"/>
+        </w:rPr>
+        <w:t>el texto. El README decía 90 casos y no mencionaba flutter test: quedó corregido.</w:t>
+      </w:r>
+    </w:p>
+    <w:p>
+      <w:pPr>
+        <w:pStyle w:val="Heading2"/>
+      </w:pPr>
+      <w:r>
+        <w:t>9.7 Lo que quedó guardado, y las confirmaciones del día</w:t>
+      </w:r>
+    </w:p>
+    <w:tbl>
+      <w:tblPr>
+        <w:tblStyle w:val="TableGrid"/>
+        <w:tblW w:type="auto" w:w="0"/>
+        <w:jc w:val="center"/>
+        <w:tblLook w:firstColumn="1" w:firstRow="1" w:lastColumn="0" w:lastRow="0" w:noHBand="0" w:noVBand="1" w:val="04A0"/>
+      </w:tblPr>
+      <w:tblGrid>
+        <w:gridCol w:w="4320"/>
+        <w:gridCol w:w="4320"/>
+      </w:tblGrid>
+      <w:tr>
+        <w:tc>
+          <w:tcPr>
+            <w:tcW w:type="dxa" w:w="4320"/>
+          </w:tcPr>
+          <w:p>
+            <w:r>
+              <w:rPr>
+                <w:b/>
+                <w:sz w:val="20"/>
+              </w:rPr>
+              <w:t>Pieza</w:t>
+            </w:r>
+          </w:p>
+        </w:tc>
+        <w:tc>
+          <w:tcPr>
+            <w:tcW w:type="dxa" w:w="4320"/>
+          </w:tcPr>
+          <w:p>
+            <w:r>
+              <w:rPr>
+                <w:b/>
+                <w:sz w:val="20"/>
+              </w:rPr>
+              <w:t>Dónde</w:t>
+            </w:r>
+          </w:p>
+        </w:tc>
+      </w:tr>
+      <w:tr>
+        <w:tc>
+          <w:tcPr>
+            <w:tcW w:type="dxa" w:w="4320"/>
+          </w:tcPr>
+          <w:p>
+            <w:r>
+              <w:rPr>
+                <w:b w:val="0"/>
+                <w:sz w:val="20"/>
+              </w:rPr>
+              <w:t>Informe del servicio y de la aplicación</w:t>
+            </w:r>
+          </w:p>
+        </w:tc>
+        <w:tc>
+          <w:tcPr>
+            <w:tcW w:type="dxa" w:w="4320"/>
+          </w:tcPr>
+          <w:p>
+            <w:r>
+              <w:rPr>
+                <w:b w:val="0"/>
+                <w:sz w:val="20"/>
+              </w:rPr>
+              <w:t>evidencia/pytest-2026-09-29.txt y .xml, evidencia/flutter-test-2026-09-29.txt</w:t>
+            </w:r>
+          </w:p>
+        </w:tc>
+      </w:tr>
+      <w:tr>
+        <w:tc>
+          <w:tcPr>
+            <w:tcW w:type="dxa" w:w="4320"/>
+          </w:tcPr>
+          <w:p>
+            <w:r>
+              <w:rPr>
+                <w:b w:val="0"/>
+                <w:sz w:val="20"/>
+              </w:rPr>
+              <w:t>Análisis estático</w:t>
+            </w:r>
+          </w:p>
+        </w:tc>
+        <w:tc>
+          <w:tcPr>
+            <w:tcW w:type="dxa" w:w="4320"/>
+          </w:tcPr>
+          <w:p>
+            <w:r>
+              <w:rPr>
+                <w:b w:val="0"/>
+                <w:sz w:val="20"/>
+              </w:rPr>
+              <w:t>evidencia/flutter-analyze-2026-09-29.txt</w:t>
+            </w:r>
+          </w:p>
+        </w:tc>
+      </w:tr>
+      <w:tr>
+        <w:tc>
+          <w:tcPr>
+            <w:tcW w:type="dxa" w:w="4320"/>
+          </w:tcPr>
+          <w:p>
+            <w:r>
+              <w:rPr>
+                <w:b w:val="0"/>
+                <w:sz w:val="20"/>
+              </w:rPr>
+              <w:t>Las dos cuentas y el control de rol</w:t>
+            </w:r>
+          </w:p>
+        </w:tc>
+        <w:tc>
+          <w:tcPr>
+            <w:tcW w:type="dxa" w:w="4320"/>
+          </w:tcPr>
+          <w:p>
+            <w:r>
+              <w:rPr>
+                <w:b w:val="0"/>
+                <w:sz w:val="20"/>
+              </w:rPr>
+              <w:t>evidencia/cuentas-de-prueba-2026-09-29.txt</w:t>
+            </w:r>
+          </w:p>
+        </w:tc>
+      </w:tr>
+      <w:tr>
+        <w:tc>
+          <w:tcPr>
+            <w:tcW w:type="dxa" w:w="4320"/>
+          </w:tcPr>
+          <w:p>
+            <w:r>
+              <w:rPr>
+                <w:b w:val="0"/>
+                <w:sz w:val="20"/>
+              </w:rPr>
+              <w:t>Reglas de la base y escalada cerrada</w:t>
+            </w:r>
+          </w:p>
+        </w:tc>
+        <w:tc>
+          <w:tcPr>
+            <w:tcW w:type="dxa" w:w="4320"/>
+          </w:tcPr>
+          <w:p>
+            <w:r>
+              <w:rPr>
+                <w:b w:val="0"/>
+                <w:sz w:val="20"/>
+              </w:rPr>
+              <w:t>evidencia/reglas-firestore-2026-09-29.txt</w:t>
+            </w:r>
+          </w:p>
+        </w:tc>
+      </w:tr>
+      <w:tr>
+        <w:tc>
+          <w:tcPr>
+            <w:tcW w:type="dxa" w:w="4320"/>
+          </w:tcPr>
+          <w:p>
+            <w:r>
+              <w:rPr>
+                <w:b w:val="0"/>
+                <w:sz w:val="20"/>
+              </w:rPr>
+              <w:t>Verificación del despliegue web</w:t>
+            </w:r>
+          </w:p>
+        </w:tc>
+        <w:tc>
+          <w:tcPr>
+            <w:tcW w:type="dxa" w:w="4320"/>
+          </w:tcPr>
+          <w:p>
+            <w:r>
+              <w:rPr>
+                <w:b w:val="0"/>
+                <w:sz w:val="20"/>
+              </w:rPr>
+              <w:t>evidencia/despliegue-web-2026-09-29.txt</w:t>
+            </w:r>
+          </w:p>
+        </w:tc>
+      </w:tr>
+      <w:tr>
+        <w:tc>
+          <w:tcPr>
+            <w:tcW w:type="dxa" w:w="4320"/>
+          </w:tcPr>
+          <w:p>
+            <w:r>
+              <w:rPr>
+                <w:b w:val="0"/>
+                <w:sz w:val="20"/>
+              </w:rPr>
+              <w:t>Requisitos de la plenaria P4</w:t>
+            </w:r>
+          </w:p>
+        </w:tc>
+        <w:tc>
+          <w:tcPr>
+            <w:tcW w:type="dxa" w:w="4320"/>
+          </w:tcPr>
+          <w:p>
+            <w:r>
+              <w:rPr>
+                <w:b w:val="0"/>
+                <w:sz w:val="20"/>
+              </w:rPr>
+              <w:t>docs/27_LO_QUE_PIDE_LA_PLENARIA_P4.md</w:t>
+            </w:r>
+          </w:p>
+        </w:tc>
+      </w:tr>
+      <w:tr>
+        <w:tc>
+          <w:tcPr>
+            <w:tcW w:type="dxa" w:w="4320"/>
+          </w:tcPr>
+          <w:p>
+            <w:r>
+              <w:rPr>
+                <w:b w:val="0"/>
+                <w:sz w:val="20"/>
+              </w:rPr>
+              <w:t>La plenaria, archivada</w:t>
+            </w:r>
+          </w:p>
+        </w:tc>
+        <w:tc>
+          <w:tcPr>
+            <w:tcW w:type="dxa" w:w="4320"/>
+          </w:tcPr>
+          <w:p>
+            <w:r>
+              <w:rPr>
+                <w:b w:val="0"/>
+                <w:sz w:val="20"/>
+              </w:rPr>
+              <w:t>docs/plenarias/P4_Pruebas_Despliegue_Defensa_Modulo4.pdf</w:t>
+            </w:r>
+          </w:p>
+        </w:tc>
+      </w:tr>
+    </w:tbl>
+    <w:p/>
+    <w:p>
+      <w:r>
+        <w:rPr>
+          <w:b w:val="0"/>
+          <w:sz w:val="22"/>
+        </w:rPr>
+        <w:t>Confirmaciones del día, en orden: 7c1f510 (pull-up del AM2302 y ciclo completo), 0a20ffa y</w:t>
+      </w:r>
+    </w:p>
+    <w:p>
+      <w:r>
+        <w:rPr>
+          <w:b w:val="0"/>
+          <w:sz w:val="22"/>
+        </w:rPr>
+        <w:t>d63fd59 (diagramas del divisor), b8171b0 (aclaración del lado del divisor), aa64057 (guía</w:t>
+      </w:r>
+    </w:p>
+    <w:p>
+      <w:r>
+        <w:rPr>
+          <w:b w:val="0"/>
+          <w:sz w:val="22"/>
+        </w:rPr>
+        <w:t>simple), ff009ce y 75e55a3 (patrón del TDS y cotización de Hanna), 6eda3d1 (la tutoría en la</w:t>
+      </w:r>
+    </w:p>
+    <w:p>
+      <w:r>
+        <w:rPr>
+          <w:b w:val="0"/>
+          <w:sz w:val="22"/>
+        </w:rPr>
+        <w:t>bitácora), bad6ef5 (requisitos de la P4), 4bf4991 (arreglo del 401 con los informes),</w:t>
+      </w:r>
+    </w:p>
+    <w:p>
+      <w:r>
+        <w:rPr>
+          <w:b w:val="0"/>
+          <w:sz w:val="22"/>
+        </w:rPr>
+        <w:t>deeda2b (cuentas de prueba) y d14aa39 (escalada de privilegios cerrada).</w:t>
+      </w:r>
+    </w:p>
+    <w:p>
+      <w:pPr>
+        <w:pStyle w:val="Heading2"/>
+      </w:pPr>
+      <w:r>
+        <w:t>9.8 Lo que sigue</w:t>
+      </w:r>
+    </w:p>
+    <w:tbl>
+      <w:tblPr>
+        <w:tblStyle w:val="TableGrid"/>
+        <w:tblW w:type="auto" w:w="0"/>
+        <w:jc w:val="center"/>
+        <w:tblLook w:firstColumn="1" w:firstRow="1" w:lastColumn="0" w:lastRow="0" w:noHBand="0" w:noVBand="1" w:val="04A0"/>
+      </w:tblPr>
+      <w:tblGrid>
+        <w:gridCol w:w="4320"/>
+        <w:gridCol w:w="4320"/>
+      </w:tblGrid>
+      <w:tr>
+        <w:tc>
+          <w:tcPr>
+            <w:tcW w:type="dxa" w:w="4320"/>
+          </w:tcPr>
+          <w:p>
+            <w:r>
+              <w:rPr>
+                <w:b/>
+                <w:sz w:val="20"/>
+              </w:rPr>
+              <w:t>Pendiente</w:t>
+            </w:r>
+          </w:p>
+        </w:tc>
+        <w:tc>
+          <w:tcPr>
+            <w:tcW w:type="dxa" w:w="4320"/>
+          </w:tcPr>
+          <w:p>
+            <w:r>
+              <w:rPr>
+                <w:b/>
+                <w:sz w:val="20"/>
+              </w:rPr>
+              <w:t>Cuándo</w:t>
+            </w:r>
+          </w:p>
+        </w:tc>
+      </w:tr>
+      <w:tr>
+        <w:tc>
+          <w:tcPr>
+            <w:tcW w:type="dxa" w:w="4320"/>
+          </w:tcPr>
+          <w:p>
+            <w:r>
+              <w:rPr>
+                <w:b w:val="0"/>
+                <w:sz w:val="20"/>
+              </w:rPr>
+              <w:t>La prueba de los dos patrones del electrodo de pH</w:t>
+            </w:r>
+          </w:p>
+        </w:tc>
+        <w:tc>
+          <w:tcPr>
+            <w:tcW w:type="dxa" w:w="4320"/>
+          </w:tcPr>
+          <w:p>
+            <w:r>
+              <w:rPr>
+                <w:b w:val="0"/>
+                <w:sz w:val="20"/>
+              </w:rPr>
+              <w:t>miércoles 30 a las 19:52, y es lo del banco</w:t>
+            </w:r>
+          </w:p>
+        </w:tc>
+      </w:tr>
+      <w:tr>
+        <w:tc>
+          <w:tcPr>
+            <w:tcW w:type="dxa" w:w="4320"/>
+          </w:tcPr>
+          <w:p>
+            <w:r>
+              <w:rPr>
+                <w:b w:val="0"/>
+                <w:sz w:val="20"/>
+              </w:rPr>
+              <w:t>El divisor ÷2 del pH, con las dos resistencias de 4,7 kΩ</w:t>
+            </w:r>
+          </w:p>
+        </w:tc>
+        <w:tc>
+          <w:tcPr>
+            <w:tcW w:type="dxa" w:w="4320"/>
+          </w:tcPr>
+          <w:p>
+            <w:r>
+              <w:rPr>
+                <w:b w:val="0"/>
+                <w:sz w:val="20"/>
+              </w:rPr>
+              <w:t>miércoles, con la prueba</w:t>
+            </w:r>
+          </w:p>
+        </w:tc>
+      </w:tr>
+      <w:tr>
+        <w:tc>
+          <w:tcPr>
+            <w:tcW w:type="dxa" w:w="4320"/>
+          </w:tcPr>
+          <w:p>
+            <w:r>
+              <w:rPr>
+                <w:b w:val="0"/>
+                <w:sz w:val="20"/>
+              </w:rPr>
+              <w:t>El mapa del repositorio para la defensa (dónde está cada cosa que pueden preguntar)</w:t>
+            </w:r>
+          </w:p>
+        </w:tc>
+        <w:tc>
+          <w:tcPr>
+            <w:tcW w:type="dxa" w:w="4320"/>
+          </w:tcPr>
+          <w:p>
+            <w:r>
+              <w:rPr>
+                <w:b w:val="0"/>
+                <w:sz w:val="20"/>
+              </w:rPr>
+              <w:t>antes del 9 de octubre</w:t>
+            </w:r>
+          </w:p>
+        </w:tc>
+      </w:tr>
+      <w:tr>
+        <w:tc>
+          <w:tcPr>
+            <w:tcW w:type="dxa" w:w="4320"/>
+          </w:tcPr>
+          <w:p>
+            <w:r>
+              <w:rPr>
+                <w:b w:val="0"/>
+                <w:sz w:val="20"/>
+              </w:rPr>
+              <w:t>La tabla 2.8 con sus casos, y las capturas fechadas del flujo completo</w:t>
+            </w:r>
+          </w:p>
+        </w:tc>
+        <w:tc>
+          <w:tcPr>
+            <w:tcW w:type="dxa" w:w="4320"/>
+          </w:tcPr>
+          <w:p>
+            <w:r>
+              <w:rPr>
+                <w:b w:val="0"/>
+                <w:sz w:val="20"/>
+              </w:rPr>
+              <w:t>para el E3 del sábado 3</w:t>
+            </w:r>
+          </w:p>
+        </w:tc>
+      </w:tr>
+      <w:tr>
+        <w:tc>
+          <w:tcPr>
+            <w:tcW w:type="dxa" w:w="4320"/>
+          </w:tcPr>
+          <w:p>
+            <w:r>
+              <w:rPr>
+                <w:b w:val="0"/>
+                <w:sz w:val="20"/>
+              </w:rPr>
+              <w:t>La medición de rendimiento sobre la URL pública</w:t>
+            </w:r>
+          </w:p>
+        </w:tc>
+        <w:tc>
+          <w:tcPr>
+            <w:tcW w:type="dxa" w:w="4320"/>
+          </w:tcPr>
+          <w:p>
+            <w:r>
+              <w:rPr>
+                <w:b w:val="0"/>
+                <w:sz w:val="20"/>
+              </w:rPr>
+              <w:t>para el E3</w:t>
+            </w:r>
+          </w:p>
+        </w:tc>
+      </w:tr>
+      <w:tr>
+        <w:tc>
+          <w:tcPr>
+            <w:tcW w:type="dxa" w:w="4320"/>
+          </w:tcPr>
+          <w:p>
+            <w:r>
+              <w:rPr>
+                <w:b w:val="0"/>
+                <w:sz w:val="20"/>
+              </w:rPr>
+              <w:t>Escribir los apartados 2.1, 2.7 y 2.8</w:t>
+            </w:r>
+          </w:p>
+        </w:tc>
+        <w:tc>
+          <w:tcPr>
+            <w:tcW w:type="dxa" w:w="4320"/>
+          </w:tcPr>
+          <w:p>
+            <w:r>
+              <w:rPr>
+                <w:b w:val="0"/>
+                <w:sz w:val="20"/>
+              </w:rPr>
+              <w:t>para el E3</w:t>
+            </w:r>
+          </w:p>
+        </w:tc>
+      </w:tr>
+    </w:tbl>
+    <w:p/>
     <w:sectPr>
       <w:pgSz w:w="12240" w:h="15840"/>
       <w:pgMar w:top="1440" w:right="1800" w:bottom="1440" w:left="1800" w:header="720" w:footer="720" w:gutter="0"/>

</xml_diff>